<commit_message>
much better template, only need to fix para spacing
</commit_message>
<xml_diff>
--- a/app/resume-templates/Template1.docx
+++ b/app/resume-templates/Template1.docx
@@ -84,21 +84,7 @@
           <w:sz w:val="20"/>
           <w:szCs w:val="20"/>
         </w:rPr>
-        <w:t>links.</w:t>
-      </w:r>
-      <w:r>
-        <w:rPr>
-          <w:sz w:val="20"/>
-          <w:szCs w:val="20"/>
-        </w:rPr>
-        <w:t>linkedin</w:t>
-      </w:r>
-      <w:r>
-        <w:rPr>
-          <w:sz w:val="20"/>
-          <w:szCs w:val="20"/>
-        </w:rPr>
-        <w:t>.show</w:t>
+        <w:t>links.linkedin.show</w:t>
       </w:r>
       <w:r>
         <w:rPr>
@@ -143,21 +129,7 @@
           <w:sz w:val="20"/>
           <w:szCs w:val="20"/>
         </w:rPr>
-        <w:t>links.</w:t>
-      </w:r>
-      <w:r>
-        <w:rPr>
-          <w:sz w:val="20"/>
-          <w:szCs w:val="20"/>
-        </w:rPr>
-        <w:t>github</w:t>
-      </w:r>
-      <w:r>
-        <w:rPr>
-          <w:sz w:val="20"/>
-          <w:szCs w:val="20"/>
-        </w:rPr>
-        <w:t>.show</w:t>
+        <w:t>links.github.show</w:t>
       </w:r>
       <w:r>
         <w:rPr>
@@ -214,6 +186,10 @@
         <w:spacing w:after="40"/>
         <w:ind w:left="180" w:right="187"/>
         <w:jc w:val="both"/>
+        <w:rPr>
+          <w:sz w:val="2"/>
+          <w:szCs w:val="2"/>
+        </w:rPr>
       </w:pPr>
       <w:r>
         <w:t>{{summary}}</w:t>
@@ -232,7 +208,14 @@
           <w:spacing w:val="-2"/>
           <w:w w:val="125"/>
         </w:rPr>
-        <w:t>Skills</w:t>
+        <w:t>S</w:t>
+      </w:r>
+      <w:r>
+        <w:rPr>
+          <w:spacing w:val="-2"/>
+          <w:w w:val="125"/>
+        </w:rPr>
+        <w:t>kills</w:t>
       </w:r>
     </w:p>
     <w:p>
@@ -249,53 +232,57 @@
         <w:rPr>
           <w:b/>
         </w:rPr>
+        <w:t>{{ skill.category }}</w:t>
+      </w:r>
+      <w:r>
+        <w:t>:</w:t>
+      </w:r>
+      <w:r>
+        <w:rPr>
+          <w:spacing w:val="-4"/>
+        </w:rPr>
+        <w:t xml:space="preserve"> </w:t>
+      </w:r>
+      <w:r>
+        <w:rPr>
+          <w:spacing w:val="-4"/>
+        </w:rPr>
+        <w:t>{{  skill.items | join(</w:t>
+      </w:r>
+      <w:r>
+        <w:rPr>
+          <w:spacing w:val="-4"/>
+        </w:rPr>
+        <w:t>"</w:t>
+      </w:r>
+      <w:r>
+        <w:rPr>
+          <w:spacing w:val="-4"/>
+        </w:rPr>
+        <w:t xml:space="preserve">, </w:t>
+      </w:r>
+      <w:r>
+        <w:rPr>
+          <w:spacing w:val="-4"/>
+        </w:rPr>
+        <w:t>"</w:t>
+      </w:r>
+      <w:r>
+        <w:rPr>
+          <w:spacing w:val="-4"/>
+        </w:rPr>
+        <w:t>)  }}</w:t>
+      </w:r>
+      <w:r>
+        <w:rPr>
+          <w:spacing w:val="-4"/>
+        </w:rPr>
         <w:br/>
-        <w:t>{{ skill.category }}</w:t>
-      </w:r>
-      <w:r>
-        <w:t>:</w:t>
       </w:r>
       <w:r>
         <w:rPr>
           <w:spacing w:val="-4"/>
         </w:rPr>
-        <w:t xml:space="preserve"> </w:t>
-      </w:r>
-      <w:r>
-        <w:rPr>
-          <w:spacing w:val="-4"/>
-        </w:rPr>
-        <w:t>{{  skill.items | join(</w:t>
-      </w:r>
-      <w:r>
-        <w:rPr>
-          <w:spacing w:val="-4"/>
-        </w:rPr>
-        <w:t>"</w:t>
-      </w:r>
-      <w:r>
-        <w:rPr>
-          <w:spacing w:val="-4"/>
-        </w:rPr>
-        <w:t xml:space="preserve">, </w:t>
-      </w:r>
-      <w:r>
-        <w:rPr>
-          <w:spacing w:val="-4"/>
-        </w:rPr>
-        <w:t>"</w:t>
-      </w:r>
-      <w:r>
-        <w:rPr>
-          <w:spacing w:val="-4"/>
-        </w:rPr>
-        <w:t>)  }}</w:t>
-      </w:r>
-      <w:r>
-        <w:rPr>
-          <w:spacing w:val="-4"/>
-        </w:rPr>
-        <w:br/>
         <w:t>{% endfor %}</w:t>
       </w:r>
     </w:p>
@@ -336,141 +323,183 @@
         </w:rPr>
         <w:t>{% for job in experience %}</w:t>
       </w:r>
-      <w:r>
-        <w:rPr>
-          <w:b/>
-          <w:sz w:val="21"/>
-          <w:szCs w:val="21"/>
-        </w:rPr>
-        <w:br/>
-        <w:t>{{ job.title }}</w:t>
-      </w:r>
-      <w:r>
-        <w:rPr>
-          <w:b/>
-          <w:sz w:val="21"/>
-          <w:szCs w:val="21"/>
-        </w:rPr>
-        <w:t xml:space="preserve"> </w:t>
-      </w:r>
-      <w:r>
-        <w:rPr>
-          <w:b/>
-          <w:spacing w:val="-2"/>
-          <w:sz w:val="21"/>
-          <w:szCs w:val="21"/>
-        </w:rPr>
-        <w:t>|</w:t>
-      </w:r>
-      <w:r>
-        <w:rPr>
-          <w:b/>
-          <w:spacing w:val="-2"/>
-          <w:sz w:val="21"/>
-          <w:szCs w:val="21"/>
-        </w:rPr>
-        <w:t xml:space="preserve"> </w:t>
-      </w:r>
-      <w:r>
-        <w:rPr>
-          <w:i/>
-          <w:iCs/>
-          <w:sz w:val="21"/>
-          <w:szCs w:val="21"/>
-        </w:rPr>
-        <w:t>{{ job.company}}</w:t>
-      </w:r>
-      <w:r>
-        <w:rPr>
-          <w:i/>
-          <w:iCs/>
-          <w:spacing w:val="-2"/>
-          <w:sz w:val="21"/>
-          <w:szCs w:val="21"/>
-        </w:rPr>
-        <w:t xml:space="preserve"> </w:t>
-      </w:r>
-      <w:r>
-        <w:rPr>
-          <w:i/>
-          <w:iCs/>
-          <w:spacing w:val="-2"/>
-          <w:sz w:val="21"/>
-          <w:szCs w:val="21"/>
-        </w:rPr>
-        <w:t xml:space="preserve">| </w:t>
-      </w:r>
-      <w:r>
-        <w:rPr>
-          <w:spacing w:val="-2"/>
-          <w:sz w:val="21"/>
-          <w:szCs w:val="21"/>
-        </w:rPr>
-        <w:t>{{  job.location}}</w:t>
-      </w:r>
-      <w:r>
-        <w:rPr>
-          <w:b/>
-          <w:sz w:val="21"/>
-          <w:szCs w:val="21"/>
-        </w:rPr>
-        <w:t xml:space="preserve">                                 </w:t>
-      </w:r>
-      <w:r>
-        <w:rPr>
-          <w:b/>
-          <w:sz w:val="21"/>
-          <w:szCs w:val="21"/>
-        </w:rPr>
-        <w:t xml:space="preserve">  </w:t>
-      </w:r>
-      <w:r>
-        <w:rPr>
-          <w:b/>
-          <w:sz w:val="21"/>
-          <w:szCs w:val="21"/>
-        </w:rPr>
-        <w:t xml:space="preserve">      </w:t>
-      </w:r>
-      <w:r>
-        <w:rPr>
-          <w:b/>
-          <w:sz w:val="21"/>
-          <w:szCs w:val="21"/>
-        </w:rPr>
-        <w:t xml:space="preserve">                              </w:t>
-      </w:r>
-      <w:r>
+    </w:p>
+    <w:tbl>
+      <w:tblPr>
+        <w:tblStyle w:val="TableGrid"/>
+        <w:tblW w:w="0" w:type="auto"/>
+        <w:tblInd w:w="287" w:type="dxa"/>
+        <w:tblBorders>
+          <w:top w:val="none" w:sz="0" w:space="0" w:color="auto"/>
+          <w:left w:val="none" w:sz="0" w:space="0" w:color="auto"/>
+          <w:bottom w:val="none" w:sz="0" w:space="0" w:color="auto"/>
+          <w:right w:val="none" w:sz="0" w:space="0" w:color="auto"/>
+          <w:insideH w:val="none" w:sz="0" w:space="0" w:color="auto"/>
+          <w:insideV w:val="none" w:sz="0" w:space="0" w:color="auto"/>
+        </w:tblBorders>
+        <w:tblLook w:val="04A0" w:firstRow="1" w:lastRow="0" w:firstColumn="1" w:lastColumn="0" w:noHBand="0" w:noVBand="1"/>
+      </w:tblPr>
+      <w:tblGrid>
+        <w:gridCol w:w="8011"/>
+        <w:gridCol w:w="3078"/>
+      </w:tblGrid>
+      <w:tr>
+        <w:tc>
+          <w:tcPr>
+            <w:tcW w:w="8011" w:type="dxa"/>
+          </w:tcPr>
+          <w:p>
+            <w:pPr>
+              <w:pStyle w:val="BodyText"/>
+              <w:tabs>
+                <w:tab w:val="left" w:pos="9138"/>
+              </w:tabs>
+              <w:ind w:left="0"/>
+              <w:jc w:val="both"/>
+              <w:rPr>
+                <w:bCs/>
+                <w:sz w:val="21"/>
+                <w:szCs w:val="21"/>
+              </w:rPr>
+            </w:pPr>
+            <w:r>
+              <w:rPr>
+                <w:b/>
+                <w:sz w:val="21"/>
+                <w:szCs w:val="21"/>
+              </w:rPr>
+              <w:t>{{ job.title }}</w:t>
+            </w:r>
+            <w:r>
+              <w:rPr>
+                <w:b/>
+                <w:sz w:val="21"/>
+                <w:szCs w:val="21"/>
+              </w:rPr>
+              <w:t xml:space="preserve"> </w:t>
+            </w:r>
+            <w:r>
+              <w:rPr>
+                <w:b/>
+                <w:spacing w:val="-2"/>
+                <w:sz w:val="21"/>
+                <w:szCs w:val="21"/>
+              </w:rPr>
+              <w:t>|</w:t>
+            </w:r>
+            <w:r>
+              <w:rPr>
+                <w:b/>
+                <w:spacing w:val="-2"/>
+                <w:sz w:val="21"/>
+                <w:szCs w:val="21"/>
+              </w:rPr>
+              <w:t xml:space="preserve"> </w:t>
+            </w:r>
+            <w:r>
+              <w:rPr>
+                <w:i/>
+                <w:iCs/>
+                <w:sz w:val="21"/>
+                <w:szCs w:val="21"/>
+              </w:rPr>
+              <w:t>{{ job.company}}</w:t>
+            </w:r>
+            <w:r>
+              <w:rPr>
+                <w:i/>
+                <w:iCs/>
+                <w:spacing w:val="-2"/>
+                <w:sz w:val="21"/>
+                <w:szCs w:val="21"/>
+              </w:rPr>
+              <w:t xml:space="preserve"> </w:t>
+            </w:r>
+            <w:r>
+              <w:rPr>
+                <w:i/>
+                <w:iCs/>
+                <w:spacing w:val="-2"/>
+                <w:sz w:val="21"/>
+                <w:szCs w:val="21"/>
+              </w:rPr>
+              <w:t xml:space="preserve">| </w:t>
+            </w:r>
+            <w:r>
+              <w:rPr>
+                <w:spacing w:val="-2"/>
+                <w:sz w:val="21"/>
+                <w:szCs w:val="21"/>
+              </w:rPr>
+              <w:t>{{  job.location}}</w:t>
+            </w:r>
+          </w:p>
+        </w:tc>
+        <w:tc>
+          <w:tcPr>
+            <w:tcW w:w="3078" w:type="dxa"/>
+          </w:tcPr>
+          <w:p>
+            <w:pPr>
+              <w:pStyle w:val="BodyText"/>
+              <w:tabs>
+                <w:tab w:val="left" w:pos="9138"/>
+              </w:tabs>
+              <w:ind w:left="0" w:right="288"/>
+              <w:jc w:val="right"/>
+              <w:rPr>
+                <w:bCs/>
+                <w:sz w:val="21"/>
+                <w:szCs w:val="21"/>
+              </w:rPr>
+            </w:pPr>
+            <w:r>
+              <w:rPr>
+                <w:bCs/>
+                <w:sz w:val="21"/>
+                <w:szCs w:val="21"/>
+              </w:rPr>
+              <w:t>{{ job.start }}</w:t>
+            </w:r>
+            <w:r>
+              <w:rPr>
+                <w:bCs/>
+                <w:sz w:val="21"/>
+                <w:szCs w:val="21"/>
+              </w:rPr>
+              <w:t xml:space="preserve"> – </w:t>
+            </w:r>
+            <w:r>
+              <w:rPr>
+                <w:bCs/>
+                <w:sz w:val="21"/>
+                <w:szCs w:val="21"/>
+              </w:rPr>
+              <w:t>{{ job.end }}</w:t>
+            </w:r>
+          </w:p>
+        </w:tc>
+      </w:tr>
+    </w:tbl>
+    <w:p>
+      <w:pPr>
+        <w:pStyle w:val="BodyText"/>
+        <w:tabs>
+          <w:tab w:val="left" w:pos="9138"/>
+        </w:tabs>
+        <w:ind w:right="187"/>
         <w:rPr>
           <w:bCs/>
           <w:sz w:val="21"/>
           <w:szCs w:val="21"/>
         </w:rPr>
-        <w:t>{{ job.start }}</w:t>
-      </w:r>
+      </w:pPr>
       <w:r>
         <w:rPr>
           <w:bCs/>
           <w:sz w:val="21"/>
           <w:szCs w:val="21"/>
         </w:rPr>
-        <w:t xml:space="preserve"> – </w:t>
-      </w:r>
-      <w:r>
-        <w:rPr>
-          <w:bCs/>
-          <w:sz w:val="21"/>
-          <w:szCs w:val="21"/>
-        </w:rPr>
-        <w:t>{{ job.end }}</w:t>
-      </w:r>
-      <w:r>
-        <w:rPr>
-          <w:bCs/>
-          <w:sz w:val="21"/>
-          <w:szCs w:val="21"/>
-        </w:rPr>
-        <w:br/>
         <w:t>{% for bullet in job.bullets %}</w:t>
       </w:r>
     </w:p>
@@ -484,8 +513,9 @@
         <w:tabs>
           <w:tab w:val="left" w:pos="768"/>
         </w:tabs>
-        <w:spacing w:before="0"/>
+        <w:spacing w:before="37"/>
         <w:ind w:left="504" w:right="720" w:hanging="216"/>
+        <w:contextualSpacing/>
         <w:rPr>
           <w:rFonts w:ascii="Microsoft Sans Serif" w:hAnsi="Microsoft Sans Serif"/>
           <w:sz w:val="20"/>
@@ -497,38 +527,33 @@
         </w:rPr>
         <w:t>{{ bullet }}</w:t>
       </w:r>
-    </w:p>
-    <w:p>
-      <w:pPr>
-        <w:tabs>
-          <w:tab w:val="left" w:pos="767"/>
-        </w:tabs>
-        <w:spacing w:before="37"/>
-        <w:rPr>
-          <w:rFonts w:ascii="Microsoft Sans Serif" w:hAnsi="Microsoft Sans Serif"/>
-          <w:sz w:val="20"/>
-        </w:rPr>
-      </w:pPr>
       <w:r>
         <w:rPr>
           <w:spacing w:val="-2"/>
           <w:sz w:val="20"/>
         </w:rPr>
-        <w:t xml:space="preserve">      </w:t>
+        <w:t>{% endfor %}</w:t>
       </w:r>
       <w:r>
         <w:rPr>
           <w:spacing w:val="-2"/>
           <w:sz w:val="20"/>
         </w:rPr>
-        <w:t>{% endfor %}</w:t>
+        <w:br/>
       </w:r>
       <w:r>
         <w:rPr>
           <w:spacing w:val="-2"/>
           <w:sz w:val="20"/>
         </w:rPr>
-        <w:t>{% endfor %}</w:t>
+        <w:t>{</w:t>
+      </w:r>
+      <w:r>
+        <w:rPr>
+          <w:spacing w:val="-2"/>
+          <w:sz w:val="20"/>
+        </w:rPr>
+        <w:t>% endfor %}</w:t>
       </w:r>
     </w:p>
     <w:p>
@@ -549,7 +574,15 @@
     <w:p>
       <w:pPr>
         <w:pStyle w:val="BodyText"/>
-        <w:ind w:left="288"/>
+        <w:tabs>
+          <w:tab w:val="left" w:pos="9138"/>
+        </w:tabs>
+        <w:ind w:right="187"/>
+        <w:rPr>
+          <w:bCs/>
+          <w:sz w:val="21"/>
+          <w:szCs w:val="21"/>
+        </w:rPr>
       </w:pPr>
       <w:r>
         <w:rPr>
@@ -561,75 +594,237 @@
       <w:r>
         <w:rPr>
           <w:bCs/>
-          <w:spacing w:val="-6"/>
-        </w:rPr>
-        <w:t>{% for project in projects %}</w:t>
-      </w:r>
-      <w:r>
-        <w:rPr>
-          <w:b/>
-          <w:spacing w:val="-6"/>
-        </w:rPr>
-        <w:t xml:space="preserve">   </w:t>
-      </w:r>
-      <w:r>
-        <w:rPr>
-          <w:b/>
-          <w:spacing w:val="-6"/>
-        </w:rPr>
-        <w:t xml:space="preserve">   </w:t>
-      </w:r>
-      <w:r>
-        <w:rPr>
-          <w:b/>
-          <w:spacing w:val="-6"/>
-        </w:rPr>
-        <w:br/>
-        <w:t>{{project.name}}</w:t>
-      </w:r>
-      <w:r>
-        <w:rPr>
-          <w:spacing w:val="-6"/>
-        </w:rPr>
-        <w:t xml:space="preserve"> – {{project.subtext}}</w:t>
-      </w:r>
-      <w:r>
-        <w:rPr>
-          <w:spacing w:val="-6"/>
-        </w:rPr>
-        <w:t xml:space="preserve"> |</w:t>
-      </w:r>
-      <w:r>
-        <w:rPr>
-          <w:spacing w:val="5"/>
-        </w:rPr>
-        <w:t xml:space="preserve"> </w:t>
-      </w:r>
-      <w:r>
-        <w:rPr>
-          <w:spacing w:val="-6"/>
-        </w:rPr>
-        <w:t>({{project.tech}})</w:t>
+          <w:sz w:val="21"/>
+          <w:szCs w:val="21"/>
+        </w:rPr>
+        <w:t xml:space="preserve">{% for </w:t>
+      </w:r>
+      <w:r>
+        <w:rPr>
+          <w:bCs/>
+          <w:sz w:val="21"/>
+          <w:szCs w:val="21"/>
+        </w:rPr>
+        <w:t>p</w:t>
+      </w:r>
+      <w:r>
+        <w:rPr>
+          <w:bCs/>
+          <w:sz w:val="21"/>
+          <w:szCs w:val="21"/>
+        </w:rPr>
+        <w:t xml:space="preserve"> in </w:t>
+      </w:r>
+      <w:r>
+        <w:rPr>
+          <w:bCs/>
+          <w:sz w:val="21"/>
+          <w:szCs w:val="21"/>
+        </w:rPr>
+        <w:t>projects</w:t>
+      </w:r>
+      <w:r>
+        <w:rPr>
+          <w:bCs/>
+          <w:sz w:val="21"/>
+          <w:szCs w:val="21"/>
+        </w:rPr>
+        <w:t xml:space="preserve"> %}</w:t>
       </w:r>
     </w:p>
+    <w:tbl>
+      <w:tblPr>
+        <w:tblStyle w:val="TableGrid"/>
+        <w:tblW w:w="0" w:type="auto"/>
+        <w:tblInd w:w="287" w:type="dxa"/>
+        <w:tblBorders>
+          <w:top w:val="none" w:sz="0" w:space="0" w:color="auto"/>
+          <w:left w:val="none" w:sz="0" w:space="0" w:color="auto"/>
+          <w:bottom w:val="none" w:sz="0" w:space="0" w:color="auto"/>
+          <w:right w:val="none" w:sz="0" w:space="0" w:color="auto"/>
+          <w:insideH w:val="none" w:sz="0" w:space="0" w:color="auto"/>
+          <w:insideV w:val="none" w:sz="0" w:space="0" w:color="auto"/>
+        </w:tblBorders>
+        <w:tblLook w:val="04A0" w:firstRow="1" w:lastRow="0" w:firstColumn="1" w:lastColumn="0" w:noHBand="0" w:noVBand="1"/>
+      </w:tblPr>
+      <w:tblGrid>
+        <w:gridCol w:w="10891"/>
+      </w:tblGrid>
+      <w:tr>
+        <w:tc>
+          <w:tcPr>
+            <w:tcW w:w="10891" w:type="dxa"/>
+          </w:tcPr>
+          <w:p>
+            <w:pPr>
+              <w:pStyle w:val="BodyText"/>
+              <w:tabs>
+                <w:tab w:val="left" w:pos="9138"/>
+              </w:tabs>
+              <w:ind w:left="0"/>
+              <w:jc w:val="both"/>
+              <w:rPr>
+                <w:bCs/>
+                <w:sz w:val="21"/>
+                <w:szCs w:val="21"/>
+              </w:rPr>
+            </w:pPr>
+            <w:r>
+              <w:rPr>
+                <w:b/>
+                <w:sz w:val="21"/>
+                <w:szCs w:val="21"/>
+              </w:rPr>
+              <w:t xml:space="preserve">{{ </w:t>
+            </w:r>
+            <w:r>
+              <w:rPr>
+                <w:b/>
+                <w:sz w:val="21"/>
+                <w:szCs w:val="21"/>
+              </w:rPr>
+              <w:t>p</w:t>
+            </w:r>
+            <w:r>
+              <w:rPr>
+                <w:b/>
+                <w:sz w:val="21"/>
+                <w:szCs w:val="21"/>
+              </w:rPr>
+              <w:t>.</w:t>
+            </w:r>
+            <w:r>
+              <w:rPr>
+                <w:b/>
+                <w:sz w:val="21"/>
+                <w:szCs w:val="21"/>
+              </w:rPr>
+              <w:t>name</w:t>
+            </w:r>
+            <w:r>
+              <w:rPr>
+                <w:b/>
+                <w:sz w:val="21"/>
+                <w:szCs w:val="21"/>
+              </w:rPr>
+              <w:t xml:space="preserve"> }}</w:t>
+            </w:r>
+            <w:r>
+              <w:rPr>
+                <w:b/>
+                <w:sz w:val="21"/>
+                <w:szCs w:val="21"/>
+              </w:rPr>
+              <w:t xml:space="preserve"> </w:t>
+            </w:r>
+            <w:r>
+              <w:rPr>
+                <w:bCs/>
+                <w:spacing w:val="-2"/>
+                <w:sz w:val="21"/>
+                <w:szCs w:val="21"/>
+              </w:rPr>
+              <w:t>– {{</w:t>
+            </w:r>
+            <w:proofErr w:type="spellStart"/>
+            <w:r>
+              <w:rPr>
+                <w:bCs/>
+                <w:spacing w:val="-2"/>
+                <w:sz w:val="21"/>
+                <w:szCs w:val="21"/>
+              </w:rPr>
+              <w:t>p.subtext</w:t>
+            </w:r>
+            <w:proofErr w:type="spellEnd"/>
+            <w:r>
+              <w:rPr>
+                <w:bCs/>
+                <w:spacing w:val="-2"/>
+                <w:sz w:val="21"/>
+                <w:szCs w:val="21"/>
+              </w:rPr>
+              <w:t>}}</w:t>
+            </w:r>
+            <w:r>
+              <w:rPr>
+                <w:bCs/>
+                <w:spacing w:val="-2"/>
+                <w:sz w:val="21"/>
+                <w:szCs w:val="21"/>
+              </w:rPr>
+              <w:t xml:space="preserve"> | {{</w:t>
+            </w:r>
+            <w:proofErr w:type="spellStart"/>
+            <w:r>
+              <w:rPr>
+                <w:bCs/>
+                <w:spacing w:val="-2"/>
+                <w:sz w:val="21"/>
+                <w:szCs w:val="21"/>
+              </w:rPr>
+              <w:t>p.tech</w:t>
+            </w:r>
+            <w:proofErr w:type="spellEnd"/>
+            <w:r>
+              <w:rPr>
+                <w:bCs/>
+                <w:spacing w:val="-2"/>
+                <w:sz w:val="21"/>
+                <w:szCs w:val="21"/>
+              </w:rPr>
+              <w:t>}}</w:t>
+            </w:r>
+          </w:p>
+        </w:tc>
+      </w:tr>
+    </w:tbl>
     <w:p>
       <w:pPr>
-        <w:pStyle w:val="ListParagraph"/>
+        <w:pStyle w:val="BodyText"/>
         <w:tabs>
-          <w:tab w:val="left" w:pos="767"/>
+          <w:tab w:val="left" w:pos="9138"/>
         </w:tabs>
-        <w:spacing w:before="37"/>
-        <w:ind w:left="505" w:firstLine="0"/>
-        <w:rPr>
-          <w:rFonts w:ascii="Microsoft Sans Serif" w:hAnsi="Microsoft Sans Serif"/>
-          <w:sz w:val="20"/>
-        </w:rPr>
-      </w:pPr>
-      <w:r>
-        <w:rPr>
-          <w:sz w:val="20"/>
-        </w:rPr>
-        <w:t>{% for b in project.bullets %}</w:t>
+        <w:ind w:right="187"/>
+        <w:rPr>
+          <w:bCs/>
+          <w:sz w:val="21"/>
+          <w:szCs w:val="21"/>
+        </w:rPr>
+      </w:pPr>
+      <w:r>
+        <w:rPr>
+          <w:bCs/>
+          <w:sz w:val="21"/>
+          <w:szCs w:val="21"/>
+        </w:rPr>
+        <w:t xml:space="preserve">{% for bullet in </w:t>
+      </w:r>
+      <w:proofErr w:type="spellStart"/>
+      <w:r>
+        <w:rPr>
+          <w:bCs/>
+          <w:sz w:val="21"/>
+          <w:szCs w:val="21"/>
+        </w:rPr>
+        <w:t>p</w:t>
+      </w:r>
+      <w:r>
+        <w:rPr>
+          <w:bCs/>
+          <w:sz w:val="21"/>
+          <w:szCs w:val="21"/>
+        </w:rPr>
+        <w:t>.bullets</w:t>
+      </w:r>
+      <w:proofErr w:type="spellEnd"/>
+      <w:r>
+        <w:rPr>
+          <w:bCs/>
+          <w:sz w:val="21"/>
+          <w:szCs w:val="21"/>
+        </w:rPr>
+        <w:t xml:space="preserve"> %}</w:t>
       </w:r>
     </w:p>
     <w:p>
@@ -640,48 +835,54 @@
           <w:numId w:val="1"/>
         </w:numPr>
         <w:tabs>
-          <w:tab w:val="left" w:pos="767"/>
+          <w:tab w:val="left" w:pos="768"/>
         </w:tabs>
-        <w:spacing w:before="0"/>
-        <w:ind w:left="504" w:hanging="216"/>
-        <w:rPr>
-          <w:sz w:val="20"/>
-        </w:rPr>
-      </w:pPr>
-      <w:r>
-        <w:rPr>
-          <w:sz w:val="20"/>
-        </w:rPr>
-        <w:t>{{b}}</w:t>
+        <w:spacing w:before="37"/>
+        <w:ind w:left="504" w:right="720" w:hanging="216"/>
+        <w:contextualSpacing/>
+        <w:rPr>
+          <w:rFonts w:ascii="Microsoft Sans Serif" w:hAnsi="Microsoft Sans Serif"/>
+          <w:sz w:val="20"/>
+        </w:rPr>
+      </w:pPr>
+      <w:r>
+        <w:rPr>
+          <w:sz w:val="20"/>
+        </w:rPr>
+        <w:t>{{ bullet }}</w:t>
+      </w:r>
+      <w:r>
+        <w:rPr>
+          <w:spacing w:val="-2"/>
+          <w:sz w:val="20"/>
+        </w:rPr>
+        <w:t>{% endfor %}</w:t>
+      </w:r>
+      <w:r>
+        <w:rPr>
+          <w:spacing w:val="-2"/>
+          <w:sz w:val="20"/>
+        </w:rPr>
+        <w:br/>
+      </w:r>
+      <w:r>
+        <w:rPr>
+          <w:spacing w:val="-2"/>
+          <w:sz w:val="20"/>
+        </w:rPr>
+        <w:t>{% endfor %}</w:t>
       </w:r>
     </w:p>
     <w:p>
       <w:pPr>
-        <w:pStyle w:val="ListParagraph"/>
-        <w:tabs>
-          <w:tab w:val="left" w:pos="767"/>
-        </w:tabs>
-        <w:spacing w:before="37"/>
-        <w:ind w:left="505" w:firstLine="0"/>
-        <w:rPr>
-          <w:rFonts w:ascii="Microsoft Sans Serif" w:hAnsi="Microsoft Sans Serif"/>
-          <w:sz w:val="20"/>
-        </w:rPr>
-      </w:pPr>
-      <w:r>
+        <w:pStyle w:val="BodyText"/>
+        <w:ind w:left="288"/>
         <w:rPr>
           <w:spacing w:val="-2"/>
-          <w:sz w:val="20"/>
-        </w:rPr>
-        <w:t>{% endfor %}</w:t>
-      </w:r>
-      <w:r>
-        <w:rPr>
-          <w:spacing w:val="-2"/>
-          <w:sz w:val="20"/>
-        </w:rPr>
-        <w:t>{% endfor %}</w:t>
-      </w:r>
+          <w:sz w:val="2"/>
+          <w:szCs w:val="2"/>
+        </w:rPr>
+      </w:pPr>
     </w:p>
     <w:p>
       <w:pPr>
@@ -706,137 +907,232 @@
         </w:tabs>
         <w:spacing w:before="37"/>
         <w:ind w:left="287"/>
-      </w:pPr>
-      <w:r>
         <w:rPr>
           <w:bCs/>
           <w:spacing w:val="-4"/>
         </w:rPr>
+      </w:pPr>
+      <w:r>
+        <w:rPr>
+          <w:bCs/>
+          <w:spacing w:val="-4"/>
+        </w:rPr>
         <w:t>{% for edu in education %}</w:t>
       </w:r>
-      <w:r>
-        <w:rPr>
-          <w:b/>
-          <w:spacing w:val="-4"/>
-        </w:rPr>
-        <w:br/>
-      </w:r>
-      <w:r>
-        <w:rPr>
-          <w:b/>
-          <w:spacing w:val="-4"/>
-        </w:rPr>
-        <w:t>{{edu.school}}</w:t>
-      </w:r>
-      <w:r>
-        <w:rPr>
-          <w:b/>
-        </w:rPr>
-        <w:tab/>
-        <w:t xml:space="preserve">      </w:t>
-      </w:r>
-      <w:r>
-        <w:rPr>
-          <w:b/>
-        </w:rPr>
-        <w:t xml:space="preserve">        </w:t>
-      </w:r>
-      <w:r>
-        <w:rPr>
-          <w:spacing w:val="-2"/>
-          <w:sz w:val="20"/>
-          <w:szCs w:val="20"/>
-        </w:rPr>
-        <w:t>{{edu.location}}</w:t>
-      </w:r>
     </w:p>
-    <w:p>
-      <w:pPr>
-        <w:pStyle w:val="BodyText"/>
-        <w:tabs>
-          <w:tab w:val="left" w:pos="9069"/>
-        </w:tabs>
-        <w:rPr>
-          <w:spacing w:val="-2"/>
-          <w:w w:val="110"/>
-        </w:rPr>
-      </w:pPr>
-      <w:r>
-        <w:rPr>
-          <w:w w:val="110"/>
-        </w:rPr>
-        <w:t>{{edu.degree}}</w:t>
-      </w:r>
-      <w:r>
-        <w:rPr>
-          <w:w w:val="110"/>
-        </w:rPr>
-        <w:t xml:space="preserve"> in </w:t>
-      </w:r>
-      <w:r>
-        <w:rPr>
-          <w:w w:val="110"/>
-        </w:rPr>
-        <w:t>{{edu.major}}</w:t>
-      </w:r>
-      <w:r>
-        <w:rPr>
-          <w:w w:val="110"/>
-        </w:rPr>
-        <w:t xml:space="preserve">                                                              GPA: </w:t>
-      </w:r>
-      <w:r>
-        <w:rPr>
-          <w:w w:val="110"/>
-        </w:rPr>
-        <w:t>{{edu.gpa}}</w:t>
-      </w:r>
-      <w:r>
-        <w:rPr>
-          <w:w w:val="110"/>
-        </w:rPr>
-        <w:t xml:space="preserve"> </w:t>
-      </w:r>
-      <w:r>
-        <w:rPr>
-          <w:w w:val="110"/>
-        </w:rPr>
-        <w:t xml:space="preserve">| </w:t>
-      </w:r>
-      <w:r>
-        <w:rPr>
-          <w:w w:val="110"/>
-        </w:rPr>
-        <w:t>{{edu.from}}</w:t>
-      </w:r>
-      <w:r>
-        <w:rPr>
-          <w:spacing w:val="1"/>
-          <w:w w:val="110"/>
-        </w:rPr>
-        <w:t xml:space="preserve"> </w:t>
-      </w:r>
-      <w:r>
-        <w:rPr>
-          <w:w w:val="110"/>
-        </w:rPr>
-        <w:t>–</w:t>
-      </w:r>
-      <w:r>
-        <w:rPr>
-          <w:spacing w:val="1"/>
-          <w:w w:val="110"/>
-        </w:rPr>
-        <w:t xml:space="preserve"> </w:t>
-      </w:r>
-      <w:r>
-        <w:rPr>
-          <w:spacing w:val="-2"/>
-          <w:w w:val="110"/>
-        </w:rPr>
-        <w:t>{{edu.to}}</w:t>
-      </w:r>
-    </w:p>
+    <w:tbl>
+      <w:tblPr>
+        <w:tblStyle w:val="TableGrid"/>
+        <w:tblW w:w="0" w:type="auto"/>
+        <w:tblInd w:w="287" w:type="dxa"/>
+        <w:tblBorders>
+          <w:top w:val="none" w:sz="0" w:space="0" w:color="auto"/>
+          <w:left w:val="none" w:sz="0" w:space="0" w:color="auto"/>
+          <w:bottom w:val="none" w:sz="0" w:space="0" w:color="auto"/>
+          <w:right w:val="none" w:sz="0" w:space="0" w:color="auto"/>
+          <w:insideH w:val="none" w:sz="0" w:space="0" w:color="auto"/>
+          <w:insideV w:val="none" w:sz="0" w:space="0" w:color="auto"/>
+        </w:tblBorders>
+        <w:tblLook w:val="04A0" w:firstRow="1" w:lastRow="0" w:firstColumn="1" w:lastColumn="0" w:noHBand="0" w:noVBand="1"/>
+      </w:tblPr>
+      <w:tblGrid>
+        <w:gridCol w:w="5538"/>
+        <w:gridCol w:w="10"/>
+        <w:gridCol w:w="5541"/>
+      </w:tblGrid>
+      <w:tr>
+        <w:tc>
+          <w:tcPr>
+            <w:tcW w:w="5538" w:type="dxa"/>
+          </w:tcPr>
+          <w:p>
+            <w:pPr>
+              <w:pStyle w:val="BodyText"/>
+              <w:tabs>
+                <w:tab w:val="left" w:pos="9138"/>
+              </w:tabs>
+              <w:ind w:left="0"/>
+              <w:jc w:val="both"/>
+              <w:rPr>
+                <w:bCs/>
+                <w:sz w:val="21"/>
+                <w:szCs w:val="21"/>
+              </w:rPr>
+            </w:pPr>
+            <w:r>
+              <w:rPr>
+                <w:b/>
+                <w:sz w:val="21"/>
+                <w:szCs w:val="21"/>
+              </w:rPr>
+              <w:t xml:space="preserve">{{ </w:t>
+            </w:r>
+            <w:r>
+              <w:rPr>
+                <w:b/>
+                <w:sz w:val="21"/>
+                <w:szCs w:val="21"/>
+              </w:rPr>
+              <w:t>edu.school</w:t>
+            </w:r>
+            <w:r>
+              <w:rPr>
+                <w:b/>
+                <w:sz w:val="21"/>
+                <w:szCs w:val="21"/>
+              </w:rPr>
+              <w:t>}}</w:t>
+            </w:r>
+          </w:p>
+        </w:tc>
+        <w:tc>
+          <w:tcPr>
+            <w:tcW w:w="5551" w:type="dxa"/>
+            <w:gridSpan w:val="2"/>
+          </w:tcPr>
+          <w:p>
+            <w:pPr>
+              <w:pStyle w:val="BodyText"/>
+              <w:tabs>
+                <w:tab w:val="left" w:pos="9138"/>
+              </w:tabs>
+              <w:ind w:left="0" w:right="288"/>
+              <w:jc w:val="right"/>
+              <w:rPr>
+                <w:bCs/>
+                <w:sz w:val="21"/>
+                <w:szCs w:val="21"/>
+              </w:rPr>
+            </w:pPr>
+            <w:r>
+              <w:rPr>
+                <w:bCs/>
+                <w:sz w:val="21"/>
+                <w:szCs w:val="21"/>
+              </w:rPr>
+              <w:t>{</w:t>
+            </w:r>
+            <w:r>
+              <w:rPr>
+                <w:bCs/>
+                <w:sz w:val="21"/>
+                <w:szCs w:val="21"/>
+              </w:rPr>
+              <w:t>{</w:t>
+            </w:r>
+            <w:r>
+              <w:rPr>
+                <w:bCs/>
+                <w:sz w:val="21"/>
+                <w:szCs w:val="21"/>
+              </w:rPr>
+              <w:t>edu.location}</w:t>
+            </w:r>
+            <w:r>
+              <w:rPr>
+                <w:bCs/>
+                <w:sz w:val="21"/>
+                <w:szCs w:val="21"/>
+              </w:rPr>
+              <w:t>}</w:t>
+            </w:r>
+          </w:p>
+        </w:tc>
+      </w:tr>
+      <w:tr>
+        <w:tblPrEx>
+          <w:tblBorders>
+            <w:top w:val="single" w:sz="4" w:space="0" w:color="auto"/>
+            <w:left w:val="single" w:sz="4" w:space="0" w:color="auto"/>
+            <w:bottom w:val="single" w:sz="4" w:space="0" w:color="auto"/>
+            <w:right w:val="single" w:sz="4" w:space="0" w:color="auto"/>
+            <w:insideH w:val="single" w:sz="4" w:space="0" w:color="auto"/>
+            <w:insideV w:val="single" w:sz="4" w:space="0" w:color="auto"/>
+          </w:tblBorders>
+        </w:tblPrEx>
+        <w:tc>
+          <w:tcPr>
+            <w:tcW w:w="5548" w:type="dxa"/>
+            <w:gridSpan w:val="2"/>
+            <w:tcBorders>
+              <w:top w:val="nil"/>
+              <w:left w:val="nil"/>
+              <w:bottom w:val="nil"/>
+              <w:right w:val="nil"/>
+            </w:tcBorders>
+          </w:tcPr>
+          <w:p>
+            <w:pPr>
+              <w:tabs>
+                <w:tab w:val="left" w:pos="8581"/>
+              </w:tabs>
+              <w:spacing w:before="37"/>
+              <w:jc w:val="both"/>
+            </w:pPr>
+            <w:r>
+              <w:rPr>
+                <w:w w:val="110"/>
+              </w:rPr>
+              <w:t>{{edu.degree}} in {{edu.major}}</w:t>
+            </w:r>
+          </w:p>
+        </w:tc>
+        <w:tc>
+          <w:tcPr>
+            <w:tcW w:w="5541" w:type="dxa"/>
+            <w:tcBorders>
+              <w:top w:val="nil"/>
+              <w:left w:val="nil"/>
+              <w:bottom w:val="nil"/>
+              <w:right w:val="nil"/>
+            </w:tcBorders>
+          </w:tcPr>
+          <w:p>
+            <w:pPr>
+              <w:tabs>
+                <w:tab w:val="left" w:pos="8581"/>
+              </w:tabs>
+              <w:spacing w:before="37"/>
+              <w:ind w:right="288"/>
+              <w:jc w:val="right"/>
+            </w:pPr>
+            <w:r>
+              <w:rPr>
+                <w:w w:val="110"/>
+              </w:rPr>
+              <w:t>GPA: {{edu.gpa}} | {{edu.from}}</w:t>
+            </w:r>
+            <w:r>
+              <w:rPr>
+                <w:spacing w:val="1"/>
+                <w:w w:val="110"/>
+              </w:rPr>
+              <w:t xml:space="preserve"> </w:t>
+            </w:r>
+            <w:r>
+              <w:rPr>
+                <w:w w:val="110"/>
+              </w:rPr>
+              <w:t>–</w:t>
+            </w:r>
+            <w:r>
+              <w:rPr>
+                <w:spacing w:val="1"/>
+                <w:w w:val="110"/>
+              </w:rPr>
+              <w:t xml:space="preserve"> </w:t>
+            </w:r>
+            <w:r>
+              <w:rPr>
+                <w:spacing w:val="-2"/>
+                <w:w w:val="110"/>
+              </w:rPr>
+              <w:t>{{edu.to}}</w:t>
+            </w:r>
+          </w:p>
+        </w:tc>
+      </w:tr>
+    </w:tbl>
     <w:p>
       <w:pPr>
         <w:pStyle w:val="BodyText"/>
@@ -979,8 +1275,126 @@
       </w:rPr>
     </w:lvl>
   </w:abstractNum>
+  <w:abstractNum w:abstractNumId="1" w15:restartNumberingAfterBreak="0">
+    <w:nsid w:val="5374563C"/>
+    <w:multiLevelType w:val="hybridMultilevel"/>
+    <w:tmpl w:val="1484514E"/>
+    <w:lvl w:ilvl="0" w:tplc="1A22FF58">
+      <w:numFmt w:val="bullet"/>
+      <w:lvlText w:val="◦"/>
+      <w:lvlJc w:val="left"/>
+      <w:pPr>
+        <w:ind w:left="1224" w:hanging="360"/>
+      </w:pPr>
+      <w:rPr>
+        <w:rFonts w:ascii="Microsoft Sans Serif" w:eastAsia="Microsoft Sans Serif" w:hAnsi="Microsoft Sans Serif" w:cs="Microsoft Sans Serif" w:hint="default"/>
+        <w:spacing w:val="0"/>
+        <w:w w:val="137"/>
+        <w:lang w:val="en-US" w:eastAsia="en-US" w:bidi="ar-SA"/>
+      </w:rPr>
+    </w:lvl>
+    <w:lvl w:ilvl="1" w:tplc="04090003" w:tentative="1">
+      <w:start w:val="1"/>
+      <w:numFmt w:val="bullet"/>
+      <w:lvlText w:val="o"/>
+      <w:lvlJc w:val="left"/>
+      <w:pPr>
+        <w:ind w:left="1944" w:hanging="360"/>
+      </w:pPr>
+      <w:rPr>
+        <w:rFonts w:ascii="Courier New" w:hAnsi="Courier New" w:hint="default"/>
+      </w:rPr>
+    </w:lvl>
+    <w:lvl w:ilvl="2" w:tplc="04090005" w:tentative="1">
+      <w:start w:val="1"/>
+      <w:numFmt w:val="bullet"/>
+      <w:lvlText w:val=""/>
+      <w:lvlJc w:val="left"/>
+      <w:pPr>
+        <w:ind w:left="2664" w:hanging="360"/>
+      </w:pPr>
+      <w:rPr>
+        <w:rFonts w:ascii="Wingdings" w:hAnsi="Wingdings" w:hint="default"/>
+      </w:rPr>
+    </w:lvl>
+    <w:lvl w:ilvl="3" w:tplc="04090001" w:tentative="1">
+      <w:start w:val="1"/>
+      <w:numFmt w:val="bullet"/>
+      <w:lvlText w:val=""/>
+      <w:lvlJc w:val="left"/>
+      <w:pPr>
+        <w:ind w:left="3384" w:hanging="360"/>
+      </w:pPr>
+      <w:rPr>
+        <w:rFonts w:ascii="Symbol" w:hAnsi="Symbol" w:hint="default"/>
+      </w:rPr>
+    </w:lvl>
+    <w:lvl w:ilvl="4" w:tplc="04090003" w:tentative="1">
+      <w:start w:val="1"/>
+      <w:numFmt w:val="bullet"/>
+      <w:lvlText w:val="o"/>
+      <w:lvlJc w:val="left"/>
+      <w:pPr>
+        <w:ind w:left="4104" w:hanging="360"/>
+      </w:pPr>
+      <w:rPr>
+        <w:rFonts w:ascii="Courier New" w:hAnsi="Courier New" w:hint="default"/>
+      </w:rPr>
+    </w:lvl>
+    <w:lvl w:ilvl="5" w:tplc="04090005" w:tentative="1">
+      <w:start w:val="1"/>
+      <w:numFmt w:val="bullet"/>
+      <w:lvlText w:val=""/>
+      <w:lvlJc w:val="left"/>
+      <w:pPr>
+        <w:ind w:left="4824" w:hanging="360"/>
+      </w:pPr>
+      <w:rPr>
+        <w:rFonts w:ascii="Wingdings" w:hAnsi="Wingdings" w:hint="default"/>
+      </w:rPr>
+    </w:lvl>
+    <w:lvl w:ilvl="6" w:tplc="04090001" w:tentative="1">
+      <w:start w:val="1"/>
+      <w:numFmt w:val="bullet"/>
+      <w:lvlText w:val=""/>
+      <w:lvlJc w:val="left"/>
+      <w:pPr>
+        <w:ind w:left="5544" w:hanging="360"/>
+      </w:pPr>
+      <w:rPr>
+        <w:rFonts w:ascii="Symbol" w:hAnsi="Symbol" w:hint="default"/>
+      </w:rPr>
+    </w:lvl>
+    <w:lvl w:ilvl="7" w:tplc="04090003" w:tentative="1">
+      <w:start w:val="1"/>
+      <w:numFmt w:val="bullet"/>
+      <w:lvlText w:val="o"/>
+      <w:lvlJc w:val="left"/>
+      <w:pPr>
+        <w:ind w:left="6264" w:hanging="360"/>
+      </w:pPr>
+      <w:rPr>
+        <w:rFonts w:ascii="Courier New" w:hAnsi="Courier New" w:hint="default"/>
+      </w:rPr>
+    </w:lvl>
+    <w:lvl w:ilvl="8" w:tplc="04090005" w:tentative="1">
+      <w:start w:val="1"/>
+      <w:numFmt w:val="bullet"/>
+      <w:lvlText w:val=""/>
+      <w:lvlJc w:val="left"/>
+      <w:pPr>
+        <w:ind w:left="6984" w:hanging="360"/>
+      </w:pPr>
+      <w:rPr>
+        <w:rFonts w:ascii="Wingdings" w:hAnsi="Wingdings" w:hint="default"/>
+      </w:rPr>
+    </w:lvl>
+  </w:abstractNum>
   <w:num w:numId="1" w16cid:durableId="1653606374">
     <w:abstractNumId w:val="0"/>
+  </w:num>
+  <w:num w:numId="2" w16cid:durableId="931472171">
+    <w:abstractNumId w:val="1"/>
   </w:num>
 </w:numbering>
 </file>
@@ -1504,6 +1918,22 @@
       <w:szCs w:val="20"/>
     </w:rPr>
   </w:style>
+  <w:style w:type="table" w:styleId="TableGrid">
+    <w:name w:val="Table Grid"/>
+    <w:basedOn w:val="TableNormal"/>
+    <w:uiPriority w:val="39"/>
+    <w:rsid w:val="00572C94"/>
+    <w:tblPr>
+      <w:tblBorders>
+        <w:top w:val="single" w:sz="4" w:space="0" w:color="auto"/>
+        <w:left w:val="single" w:sz="4" w:space="0" w:color="auto"/>
+        <w:bottom w:val="single" w:sz="4" w:space="0" w:color="auto"/>
+        <w:right w:val="single" w:sz="4" w:space="0" w:color="auto"/>
+        <w:insideH w:val="single" w:sz="4" w:space="0" w:color="auto"/>
+        <w:insideV w:val="single" w:sz="4" w:space="0" w:color="auto"/>
+      </w:tblBorders>
+    </w:tblPr>
+  </w:style>
 </w:styles>
 </file>
 

</xml_diff>

<commit_message>
bettered the template, only fix left - bullets and para spacing
</commit_message>
<xml_diff>
--- a/app/resume-templates/Template1.docx
+++ b/app/resume-templates/Template1.docx
@@ -317,8 +317,8 @@
         <w:ind w:right="187"/>
         <w:rPr>
           <w:bCs/>
-          <w:sz w:val="21"/>
-          <w:szCs w:val="21"/>
+          <w:sz w:val="2"/>
+          <w:szCs w:val="2"/>
         </w:rPr>
       </w:pPr>
       <w:r>
@@ -327,7 +327,23 @@
           <w:sz w:val="21"/>
           <w:szCs w:val="21"/>
         </w:rPr>
-        <w:t>{% for job in experience %}</w:t>
+        <w:t xml:space="preserve">{% for </w:t>
+      </w:r>
+      <w:r>
+        <w:rPr>
+          <w:bCs/>
+          <w:sz w:val="21"/>
+          <w:szCs w:val="21"/>
+        </w:rPr>
+        <w:t>j</w:t>
+      </w:r>
+      <w:r>
+        <w:rPr>
+          <w:bCs/>
+          <w:sz w:val="21"/>
+          <w:szCs w:val="21"/>
+        </w:rPr>
+        <w:t xml:space="preserve"> in experience %}</w:t>
       </w:r>
     </w:p>
     <w:tbl>
@@ -346,13 +362,13 @@
         <w:tblLook w:val="04A0" w:firstRow="1" w:lastRow="0" w:firstColumn="1" w:lastColumn="0" w:noHBand="0" w:noVBand="1"/>
       </w:tblPr>
       <w:tblGrid>
-        <w:gridCol w:w="8011"/>
-        <w:gridCol w:w="3078"/>
+        <w:gridCol w:w="8461"/>
+        <w:gridCol w:w="2628"/>
       </w:tblGrid>
       <w:tr>
         <w:tc>
           <w:tcPr>
-            <w:tcW w:w="8011" w:type="dxa"/>
+            <w:tcW w:w="8461" w:type="dxa"/>
           </w:tcPr>
           <w:p>
             <w:pPr>
@@ -374,7 +390,23 @@
                 <w:sz w:val="21"/>
                 <w:szCs w:val="21"/>
               </w:rPr>
-              <w:t>{{ job.title }}</w:t>
+              <w:t xml:space="preserve">{{ </w:t>
+            </w:r>
+            <w:r>
+              <w:rPr>
+                <w:b/>
+                <w:sz w:val="21"/>
+                <w:szCs w:val="21"/>
+              </w:rPr>
+              <w:t>j</w:t>
+            </w:r>
+            <w:r>
+              <w:rPr>
+                <w:b/>
+                <w:sz w:val="21"/>
+                <w:szCs w:val="21"/>
+              </w:rPr>
+              <w:t>.title }}</w:t>
             </w:r>
             <w:r>
               <w:rPr>
@@ -409,7 +441,25 @@
                 <w:sz w:val="21"/>
                 <w:szCs w:val="21"/>
               </w:rPr>
-              <w:t>{{ job.company}}</w:t>
+              <w:t xml:space="preserve">{{ </w:t>
+            </w:r>
+            <w:r>
+              <w:rPr>
+                <w:i/>
+                <w:iCs/>
+                <w:sz w:val="21"/>
+                <w:szCs w:val="21"/>
+              </w:rPr>
+              <w:t>j</w:t>
+            </w:r>
+            <w:r>
+              <w:rPr>
+                <w:i/>
+                <w:iCs/>
+                <w:sz w:val="21"/>
+                <w:szCs w:val="21"/>
+              </w:rPr>
+              <w:t>.company}}</w:t>
             </w:r>
             <w:r>
               <w:rPr>
@@ -437,13 +487,29 @@
                 <w:sz w:val="21"/>
                 <w:szCs w:val="21"/>
               </w:rPr>
-              <w:t>{{  job.location}}</w:t>
+              <w:t xml:space="preserve">{{  </w:t>
+            </w:r>
+            <w:r>
+              <w:rPr>
+                <w:spacing w:val="-2"/>
+                <w:sz w:val="21"/>
+                <w:szCs w:val="21"/>
+              </w:rPr>
+              <w:t>j</w:t>
+            </w:r>
+            <w:r>
+              <w:rPr>
+                <w:spacing w:val="-2"/>
+                <w:sz w:val="21"/>
+                <w:szCs w:val="21"/>
+              </w:rPr>
+              <w:t>.location}}</w:t>
             </w:r>
           </w:p>
         </w:tc>
         <w:tc>
           <w:tcPr>
-            <w:tcW w:w="3078" w:type="dxa"/>
+            <w:tcW w:w="2628" w:type="dxa"/>
           </w:tcPr>
           <w:p>
             <w:pPr>
@@ -465,7 +531,7 @@
                 <w:sz w:val="21"/>
                 <w:szCs w:val="21"/>
               </w:rPr>
-              <w:t>{{ job.start }}</w:t>
+              <w:t xml:space="preserve">{{ </w:t>
             </w:r>
             <w:r>
               <w:rPr>
@@ -473,6 +539,22 @@
                 <w:sz w:val="21"/>
                 <w:szCs w:val="21"/>
               </w:rPr>
+              <w:t>j</w:t>
+            </w:r>
+            <w:r>
+              <w:rPr>
+                <w:bCs/>
+                <w:sz w:val="21"/>
+                <w:szCs w:val="21"/>
+              </w:rPr>
+              <w:t>.start }}</w:t>
+            </w:r>
+            <w:r>
+              <w:rPr>
+                <w:bCs/>
+                <w:sz w:val="21"/>
+                <w:szCs w:val="21"/>
+              </w:rPr>
               <w:t xml:space="preserve"> – </w:t>
             </w:r>
             <w:r>
@@ -481,7 +563,23 @@
                 <w:sz w:val="21"/>
                 <w:szCs w:val="21"/>
               </w:rPr>
-              <w:t>{{ job.end }}</w:t>
+              <w:t xml:space="preserve">{{ </w:t>
+            </w:r>
+            <w:r>
+              <w:rPr>
+                <w:bCs/>
+                <w:sz w:val="21"/>
+                <w:szCs w:val="21"/>
+              </w:rPr>
+              <w:t>j</w:t>
+            </w:r>
+            <w:r>
+              <w:rPr>
+                <w:bCs/>
+                <w:sz w:val="21"/>
+                <w:szCs w:val="21"/>
+              </w:rPr>
+              <w:t>.end }}</w:t>
             </w:r>
           </w:p>
         </w:tc>
@@ -496,8 +594,8 @@
         <w:ind w:right="187"/>
         <w:rPr>
           <w:bCs/>
-          <w:sz w:val="21"/>
-          <w:szCs w:val="21"/>
+          <w:sz w:val="2"/>
+          <w:szCs w:val="2"/>
         </w:rPr>
       </w:pPr>
       <w:r>
@@ -506,7 +604,23 @@
           <w:sz w:val="21"/>
           <w:szCs w:val="21"/>
         </w:rPr>
-        <w:t>{% for bullet in job.bullets %}</w:t>
+        <w:t xml:space="preserve">{% for bullet in </w:t>
+      </w:r>
+      <w:r>
+        <w:rPr>
+          <w:bCs/>
+          <w:sz w:val="21"/>
+          <w:szCs w:val="21"/>
+        </w:rPr>
+        <w:t>j</w:t>
+      </w:r>
+      <w:r>
+        <w:rPr>
+          <w:bCs/>
+          <w:sz w:val="21"/>
+          <w:szCs w:val="21"/>
+        </w:rPr>
+        <w:t>.bullets %}</w:t>
       </w:r>
     </w:p>
     <w:p>
@@ -569,6 +683,7 @@
           <w:bottom w:val="single" w:sz="4" w:space="1" w:color="auto"/>
         </w:pBdr>
         <w:spacing w:before="86"/>
+        <w:ind w:left="0"/>
       </w:pPr>
       <w:r>
         <w:rPr>
@@ -698,9 +813,8 @@
                 <w:sz w:val="21"/>
                 <w:szCs w:val="21"/>
               </w:rPr>
-              <w:t>– {{</w:t>
-            </w:r>
-            <w:proofErr w:type="spellStart"/>
+              <w:t>– {{p.subtext}}</w:t>
+            </w:r>
             <w:r>
               <w:rPr>
                 <w:bCs/>
@@ -708,46 +822,7 @@
                 <w:sz w:val="21"/>
                 <w:szCs w:val="21"/>
               </w:rPr>
-              <w:t>p.subtext</w:t>
-            </w:r>
-            <w:proofErr w:type="spellEnd"/>
-            <w:r>
-              <w:rPr>
-                <w:bCs/>
-                <w:spacing w:val="-2"/>
-                <w:sz w:val="21"/>
-                <w:szCs w:val="21"/>
-              </w:rPr>
-              <w:t>}}</w:t>
-            </w:r>
-            <w:r>
-              <w:rPr>
-                <w:bCs/>
-                <w:spacing w:val="-2"/>
-                <w:sz w:val="21"/>
-                <w:szCs w:val="21"/>
-              </w:rPr>
-              <w:t xml:space="preserve"> | {{</w:t>
-            </w:r>
-            <w:proofErr w:type="spellStart"/>
-            <w:r>
-              <w:rPr>
-                <w:bCs/>
-                <w:spacing w:val="-2"/>
-                <w:sz w:val="21"/>
-                <w:szCs w:val="21"/>
-              </w:rPr>
-              <w:t>p.tech</w:t>
-            </w:r>
-            <w:proofErr w:type="spellEnd"/>
-            <w:r>
-              <w:rPr>
-                <w:bCs/>
-                <w:spacing w:val="-2"/>
-                <w:sz w:val="21"/>
-                <w:szCs w:val="21"/>
-              </w:rPr>
-              <w:t>}}</w:t>
+              <w:t xml:space="preserve"> | {{p.tech}}</w:t>
             </w:r>
           </w:p>
         </w:tc>
@@ -762,8 +837,8 @@
         <w:ind w:right="187"/>
         <w:rPr>
           <w:bCs/>
-          <w:sz w:val="21"/>
-          <w:szCs w:val="21"/>
+          <w:sz w:val="2"/>
+          <w:szCs w:val="2"/>
         </w:rPr>
       </w:pPr>
       <w:r>
@@ -772,25 +847,7 @@
           <w:sz w:val="21"/>
           <w:szCs w:val="21"/>
         </w:rPr>
-        <w:t xml:space="preserve">{% for bullet in </w:t>
-      </w:r>
-      <w:proofErr w:type="spellStart"/>
-      <w:r>
-        <w:rPr>
-          <w:bCs/>
-          <w:sz w:val="21"/>
-          <w:szCs w:val="21"/>
-        </w:rPr>
-        <w:t>p.bullets</w:t>
-      </w:r>
-      <w:proofErr w:type="spellEnd"/>
-      <w:r>
-        <w:rPr>
-          <w:bCs/>
-          <w:sz w:val="21"/>
-          <w:szCs w:val="21"/>
-        </w:rPr>
-        <w:t xml:space="preserve"> %}</w:t>
+        <w:t>{% for bullet in p.bullets %}</w:t>
       </w:r>
     </w:p>
     <w:p>

</xml_diff>